<commit_message>
docs: diagramme de Gantt en image dans le document de pilotage (au lieu du code Mermaid)
</commit_message>
<xml_diff>
--- a/docs/exports/pilotage-projet.docx
+++ b/docs/exports/pilotage-projet.docx
@@ -471,243 +471,44 @@
       </w:r>
     </w:p>
     <w:p>
+      <w:pPr>
+        <w:jc w:val="center"/>
+      </w:pPr>
       <w:r>
-        <w:rPr>
-          <w:i/>
-          <w:color w:val="444444"/>
-          <w:sz w:val="20"/>
-        </w:rPr>
-        <w:t>Diagramme (planning) — rendu visuel dans la version Markdown / l’outil de gestion.</w:t>
+        <w:drawing>
+          <wp:inline xmlns:a="http://schemas.openxmlformats.org/drawingml/2006/main" xmlns:pic="http://schemas.openxmlformats.org/drawingml/2006/picture">
+            <wp:extent cx="5760000" cy="2400742"/>
+            <wp:docPr id="1" name="Picture 1"/>
+            <wp:cNvGraphicFramePr>
+              <a:graphicFrameLocks noChangeAspect="1"/>
+            </wp:cNvGraphicFramePr>
+            <a:graphic>
+              <a:graphicData uri="http://schemas.openxmlformats.org/drawingml/2006/picture">
+                <pic:pic>
+                  <pic:nvPicPr>
+                    <pic:cNvPr id="0" name="gantt.jpg"/>
+                    <pic:cNvPicPr/>
+                  </pic:nvPicPr>
+                  <pic:blipFill>
+                    <a:blip r:embed="rId9"/>
+                    <a:stretch>
+                      <a:fillRect/>
+                    </a:stretch>
+                  </pic:blipFill>
+                  <pic:spPr>
+                    <a:xfrm>
+                      <a:off x="0" y="0"/>
+                      <a:ext cx="5760000" cy="2400742"/>
+                    </a:xfrm>
+                    <a:prstGeom prst="rect"/>
+                  </pic:spPr>
+                </pic:pic>
+              </a:graphicData>
+            </a:graphic>
+          </wp:inline>
+        </w:drawing>
       </w:r>
     </w:p>
-    <w:p>
-      <w:pPr>
-        <w:ind w:left="227"/>
-        <w:shd w:val="clear" w:color="auto" w:fill="F2F2F2"/>
-        <w:pBdr>
-          <w:top w:val="single" w:sz="4" w:space="4" w:color="CCCCCC"/>
-          <w:left w:val="single" w:sz="4" w:space="4" w:color="CCCCCC"/>
-          <w:bottom w:val="single" w:sz="4" w:space="4" w:color="CCCCCC"/>
-          <w:right w:val="single" w:sz="4" w:space="4" w:color="CCCCCC"/>
-        </w:pBdr>
-      </w:pPr>
-      <w:r>
-        <w:rPr>
-          <w:rFonts w:ascii="Consolas" w:hAnsi="Consolas"/>
-          <w:sz w:val="18"/>
-        </w:rPr>
-        <w:t>gantt</w:t>
-        <w:br/>
-      </w:r>
-      <w:r>
-        <w:rPr>
-          <w:rFonts w:ascii="Consolas" w:hAnsi="Consolas"/>
-          <w:sz w:val="18"/>
-        </w:rPr>
-        <w:t xml:space="preserve">    title Planning du projet — Potentiel PV tertiaire (semaine du 29/06 au 08/07/2026)</w:t>
-        <w:br/>
-      </w:r>
-      <w:r>
-        <w:rPr>
-          <w:rFonts w:ascii="Consolas" w:hAnsi="Consolas"/>
-          <w:sz w:val="18"/>
-        </w:rPr>
-        <w:t xml:space="preserve">    dateFormat  YYYY-MM-DD</w:t>
-        <w:br/>
-      </w:r>
-      <w:r>
-        <w:rPr>
-          <w:rFonts w:ascii="Consolas" w:hAnsi="Consolas"/>
-          <w:sz w:val="18"/>
-        </w:rPr>
-        <w:t xml:space="preserve">    axisFormat  %d/%m</w:t>
-        <w:br/>
-      </w:r>
-      <w:r>
-        <w:rPr>
-          <w:rFonts w:ascii="Consolas" w:hAnsi="Consolas"/>
-          <w:sz w:val="18"/>
-        </w:rPr>
-        <w:t xml:space="preserve"> </w:t>
-        <w:br/>
-      </w:r>
-      <w:r>
-        <w:rPr>
-          <w:rFonts w:ascii="Consolas" w:hAnsi="Consolas"/>
-          <w:sz w:val="18"/>
-        </w:rPr>
-        <w:t xml:space="preserve">    section Cadrage</w:t>
-        <w:br/>
-      </w:r>
-      <w:r>
-        <w:rPr>
-          <w:rFonts w:ascii="Consolas" w:hAnsi="Consolas"/>
-          <w:sz w:val="18"/>
-        </w:rPr>
-        <w:t xml:space="preserve">    Note de cadrage (besoins, réglementation, périmètre) :done, cadrage, 2026-06-29, 1d</w:t>
-        <w:br/>
-      </w:r>
-      <w:r>
-        <w:rPr>
-          <w:rFonts w:ascii="Consolas" w:hAnsi="Consolas"/>
-          <w:sz w:val="18"/>
-        </w:rPr>
-        <w:t xml:space="preserve"> </w:t>
-        <w:br/>
-      </w:r>
-      <w:r>
-        <w:rPr>
-          <w:rFonts w:ascii="Consolas" w:hAnsi="Consolas"/>
-          <w:sz w:val="18"/>
-        </w:rPr>
-        <w:t xml:space="preserve">    section Collecte données</w:t>
-        <w:br/>
-      </w:r>
-      <w:r>
-        <w:rPr>
-          <w:rFonts w:ascii="Consolas" w:hAnsi="Consolas"/>
-          <w:sz w:val="18"/>
-        </w:rPr>
-        <w:t xml:space="preserve">    Récupération PVGIS (96 départements) + cache :done, data1, after cadrage, 1d</w:t>
-        <w:br/>
-      </w:r>
-      <w:r>
-        <w:rPr>
-          <w:rFonts w:ascii="Consolas" w:hAnsi="Consolas"/>
-          <w:sz w:val="18"/>
-        </w:rPr>
-        <w:t xml:space="preserve">    Intégration GeoJSON officiel + centroïdes Lambert-93 :done, data2, after data1, 1d</w:t>
-        <w:br/>
-      </w:r>
-      <w:r>
-        <w:rPr>
-          <w:rFonts w:ascii="Consolas" w:hAnsi="Consolas"/>
-          <w:sz w:val="18"/>
-        </w:rPr>
-        <w:t xml:space="preserve"> </w:t>
-        <w:br/>
-      </w:r>
-      <w:r>
-        <w:rPr>
-          <w:rFonts w:ascii="Consolas" w:hAnsi="Consolas"/>
-          <w:sz w:val="18"/>
-        </w:rPr>
-        <w:t xml:space="preserve">    section Modèle économique</w:t>
-        <w:br/>
-      </w:r>
-      <w:r>
-        <w:rPr>
-          <w:rFonts w:ascii="Consolas" w:hAnsi="Consolas"/>
-          <w:sz w:val="18"/>
-        </w:rPr>
-        <w:t xml:space="preserve">    Modèle LCOE / payback / TRI / VAN + tests unitaires :done, model, after data2, 1d</w:t>
-        <w:br/>
-      </w:r>
-      <w:r>
-        <w:rPr>
-          <w:rFonts w:ascii="Consolas" w:hAnsi="Consolas"/>
-          <w:sz w:val="18"/>
-        </w:rPr>
-        <w:t xml:space="preserve">    Taux d'autoconsommation + analyse de sensibilité :done, model2, after model, 1d</w:t>
-        <w:br/>
-      </w:r>
-      <w:r>
-        <w:rPr>
-          <w:rFonts w:ascii="Consolas" w:hAnsi="Consolas"/>
-          <w:sz w:val="18"/>
-        </w:rPr>
-        <w:t xml:space="preserve"> </w:t>
-        <w:br/>
-      </w:r>
-      <w:r>
-        <w:rPr>
-          <w:rFonts w:ascii="Consolas" w:hAnsi="Consolas"/>
-          <w:sz w:val="18"/>
-        </w:rPr>
-        <w:t xml:space="preserve">    section Dashboard</w:t>
-        <w:br/>
-      </w:r>
-      <w:r>
-        <w:rPr>
-          <w:rFonts w:ascii="Consolas" w:hAnsi="Consolas"/>
-          <w:sz w:val="18"/>
-        </w:rPr>
-        <w:t xml:space="preserve">    Refactor Assumptions (hypothèses paramétrables) :done, dash1, after model2, 1d</w:t>
-        <w:br/>
-      </w:r>
-      <w:r>
-        <w:rPr>
-          <w:rFonts w:ascii="Consolas" w:hAnsi="Consolas"/>
-          <w:sz w:val="18"/>
-        </w:rPr>
-        <w:t xml:space="preserve">    Dashboard Streamlit (cartes, KPI, sensibilité) + déploiement :active, dash2, after dash1, 1d</w:t>
-        <w:br/>
-      </w:r>
-      <w:r>
-        <w:rPr>
-          <w:rFonts w:ascii="Consolas" w:hAnsi="Consolas"/>
-          <w:sz w:val="18"/>
-        </w:rPr>
-        <w:t xml:space="preserve"> </w:t>
-        <w:br/>
-      </w:r>
-      <w:r>
-        <w:rPr>
-          <w:rFonts w:ascii="Consolas" w:hAnsi="Consolas"/>
-          <w:sz w:val="18"/>
-        </w:rPr>
-        <w:t xml:space="preserve">    section Recettage</w:t>
-        <w:br/>
-      </w:r>
-      <w:r>
-        <w:rPr>
-          <w:rFonts w:ascii="Consolas" w:hAnsi="Consolas"/>
-          <w:sz w:val="18"/>
-        </w:rPr>
-        <w:t xml:space="preserve">    Tests dashboard_data + relecture croisée :recette, after dash2, 1d</w:t>
-        <w:br/>
-      </w:r>
-      <w:r>
-        <w:rPr>
-          <w:rFonts w:ascii="Consolas" w:hAnsi="Consolas"/>
-          <w:sz w:val="18"/>
-        </w:rPr>
-        <w:t xml:space="preserve"> </w:t>
-        <w:br/>
-      </w:r>
-      <w:r>
-        <w:rPr>
-          <w:rFonts w:ascii="Consolas" w:hAnsi="Consolas"/>
-          <w:sz w:val="18"/>
-        </w:rPr>
-        <w:t xml:space="preserve">    section Dossier &amp; soutenance</w:t>
-        <w:br/>
-      </w:r>
-      <w:r>
-        <w:rPr>
-          <w:rFonts w:ascii="Consolas" w:hAnsi="Consolas"/>
-          <w:sz w:val="18"/>
-        </w:rPr>
-        <w:t xml:space="preserve">    Document de pilotage :pilotage, after dash2, 1d</w:t>
-        <w:br/>
-      </w:r>
-      <w:r>
-        <w:rPr>
-          <w:rFonts w:ascii="Consolas" w:hAnsi="Consolas"/>
-          <w:sz w:val="18"/>
-        </w:rPr>
-        <w:t xml:space="preserve">    Dossier technique (compilation + exports Word/PDF) :dossier, after pilotage, 1d</w:t>
-        <w:br/>
-      </w:r>
-      <w:r>
-        <w:rPr>
-          <w:rFonts w:ascii="Consolas" w:hAnsi="Consolas"/>
-          <w:sz w:val="18"/>
-        </w:rPr>
-        <w:t xml:space="preserve">    Soutenance :milestone, soutenance, after dossier, 0d</w:t>
-      </w:r>
-    </w:p>
-    <w:p/>
     <w:p>
       <w:r>
         <w:rPr>

</xml_diff>